<commit_message>
fix: update presentation timings and enhance accessibility details in the script
</commit_message>
<xml_diff>
--- a/docs/apresentacao/Roteiro_Simplificado.docx
+++ b/docs/apresentacao/Roteiro_Simplificado.docx
@@ -89,7 +89,7 @@
           <w:sz w:val="22"/>
           <w:szCs w:val="22"/>
         </w:rPr>
-        <w:t xml:space="preserve">2.  Bruno        — Solução + Demo    (3:30)</w:t>
+        <w:t xml:space="preserve">2.  Bruno        — Solução + Demo    (3:45)</w:t>
       </w:r>
     </w:p>
     <w:p>
@@ -102,7 +102,7 @@
           <w:sz w:val="22"/>
           <w:szCs w:val="22"/>
         </w:rPr>
-        <w:t xml:space="preserve">3.  Liane        — Acessibilidade    (1:30)</w:t>
+        <w:t xml:space="preserve">3.  Liane        — Acessibilidade    (2:00)</w:t>
       </w:r>
     </w:p>
     <w:p>
@@ -128,7 +128,7 @@
           <w:sz w:val="22"/>
           <w:szCs w:val="22"/>
         </w:rPr>
-        <w:t xml:space="preserve">5.  Diogo        — User Tests        (1:30)</w:t>
+        <w:t xml:space="preserve">5.  Diogo        — User Tests        (1:15)</w:t>
       </w:r>
     </w:p>
     <w:p>
@@ -142,6 +142,21 @@
           <w:szCs w:val="22"/>
         </w:rPr>
         <w:t xml:space="preserve">6.  Filipe       — Fecho              (0:30)</w:t>
+      </w:r>
+    </w:p>
+    <w:p>
+      <w:pPr>
+        <w:spacing w:after="60" w:before="80"/>
+      </w:pPr>
+      <w:r>
+        <w:rPr>
+          <w:rFonts w:ascii="Consolas" w:cs="Consolas" w:eastAsia="Consolas" w:hAnsi="Consolas"/>
+          <w:b/>
+          <w:bCs/>
+          <w:sz w:val="22"/>
+          <w:szCs w:val="22"/>
+        </w:rPr>
+        <w:t xml:space="preserve">                                       TOTAL  10:30</w:t>
       </w:r>
     </w:p>
     <w:p>
@@ -340,7 +355,7 @@
           <w:sz w:val="22"/>
           <w:szCs w:val="22"/>
         </w:rPr>
-        <w:t xml:space="preserve">3 min 30 seg total  ·  Slides 3, 4, 5</w:t>
+        <w:t xml:space="preserve">3 min 45 seg total  ·  Slides 3, 4, 5</w:t>
       </w:r>
     </w:p>
     <w:p>
@@ -356,20 +371,20 @@
           <w:sz w:val="22"/>
           <w:szCs w:val="22"/>
         </w:rPr>
-        <w:t xml:space="preserve">▶ Slide 3 — Solução em 1 ecrã  (30 seg)</w:t>
-      </w:r>
-    </w:p>
-    <w:p>
-      <w:pPr>
-        <w:spacing w:after="180" w:before="120" w:line="360"/>
-      </w:pPr>
-      <w:r>
-        <w:rPr>
-          <w:rFonts w:ascii="Calibri" w:cs="Calibri" w:eastAsia="Calibri" w:hAnsi="Calibri"/>
-          <w:sz w:val="28"/>
-          <w:szCs w:val="28"/>
-        </w:rPr>
-        <w:t xml:space="preserve">O UTAD Maps é uma aplicação mobile-first multi-plataforma — funciona em iOS, Android e Web a partir de um único link, sem instalação.</w:t>
+        <w:t xml:space="preserve">▶ Slide 3 — Solução em 1 ecrã  (45 seg)</w:t>
+      </w:r>
+    </w:p>
+    <w:p>
+      <w:pPr>
+        <w:spacing w:after="180" w:before="120" w:line="360"/>
+      </w:pPr>
+      <w:r>
+        <w:rPr>
+          <w:rFonts w:ascii="Calibri" w:cs="Calibri" w:eastAsia="Calibri" w:hAnsi="Calibri"/>
+          <w:sz w:val="28"/>
+          <w:szCs w:val="28"/>
+        </w:rPr>
+        <w:t xml:space="preserve">O UTAD Maps é uma aplicação mobile-first construída em React Native com Expo, TypeScript em todo o código-fonte, Three.js para a renderização indoor 3D, e Supabase para o backend. Funciona em iOS, Android e Web a partir de um único link, sem instalação.</w:t>
       </w:r>
     </w:p>
     <w:p>
@@ -625,7 +640,7 @@
           <w:sz w:val="22"/>
           <w:szCs w:val="22"/>
         </w:rPr>
-        <w:t xml:space="preserve">1 min 30 seg  ·  Slide 6</w:t>
+        <w:t xml:space="preserve">2 min  ·  Slide 6</w:t>
       </w:r>
     </w:p>
     <w:p>
@@ -651,33 +666,88 @@
           <w:sz w:val="28"/>
           <w:szCs w:val="28"/>
         </w:rPr>
-        <w:t xml:space="preserve">Combinámos quatro ferramentas automáticas — Lighthouse, axe-core, pa11y e a T.A.W. — com quatro análises manuais, incluindo teste real com o leitor de ecrã VoiceOver num iPhone.</w:t>
-      </w:r>
-    </w:p>
-    <w:p>
-      <w:pPr>
-        <w:spacing w:after="180" w:before="120" w:line="360"/>
-      </w:pPr>
-      <w:r>
-        <w:rPr>
-          <w:rFonts w:ascii="Calibri" w:cs="Calibri" w:eastAsia="Calibri" w:hAnsi="Calibri"/>
-          <w:sz w:val="28"/>
-          <w:szCs w:val="28"/>
-        </w:rPr>
-        <w:t xml:space="preserve">Os resultados estão no ecrã: 100 em 100 no Lighthouse, 29 dos 34 critérios WCAG 2.2 nível AA totalmente conformes — o que corresponde a 85 por cento de conformidade plena — e identificámos no processo nove correcções concretas que foram aplicadas durante a própria Fase 2.</w:t>
-      </w:r>
-    </w:p>
-    <w:p>
-      <w:pPr>
-        <w:spacing w:after="180" w:before="120" w:line="360"/>
-      </w:pPr>
-      <w:r>
-        <w:rPr>
-          <w:rFonts w:ascii="Calibri" w:cs="Calibri" w:eastAsia="Calibri" w:hAnsi="Calibri"/>
-          <w:sz w:val="28"/>
-          <w:szCs w:val="28"/>
-        </w:rPr>
-        <w:t xml:space="preserve">A lição metodológica é importante: as ferramentas automáticas só detectam 30 a 40 por cento dos problemas reais. O bug B-05, que afectava utilizadores com texto a 200 por cento, só foi descoberto pelo nosso teste manual de responsividade — nenhuma das quatro ferramentas o apanhou.</w:t>
+        <w:t xml:space="preserve">Importa esclarecer uma distinção metodológica: a versão hospedada em utadmaps.b-host.me — onde corremos as ferramentas automáticas — é um subproduto web gerado pelo Expo a partir do mesmo código, com algumas funcionalidades limitadas. A versão mobile completa, com indoor 3D, foi testada manualmente via Expo Go num iPhone real. Esta é exactamente a razão pela qual combinámos auto com manual: nenhum dos dois sozinho cobria a aplicação inteira.</w:t>
+      </w:r>
+    </w:p>
+    <w:p>
+      <w:pPr>
+        <w:spacing w:after="180" w:before="120" w:line="360"/>
+      </w:pPr>
+      <w:r>
+        <w:rPr>
+          <w:rFonts w:ascii="Calibri" w:cs="Calibri" w:eastAsia="Calibri" w:hAnsi="Calibri"/>
+          <w:sz w:val="28"/>
+          <w:szCs w:val="28"/>
+        </w:rPr>
+        <w:t xml:space="preserve">No lado automático corremos quatro ferramentas: Lighthouse, axe-core, pa11y e a T.A.W. recomendada pelos docentes.</w:t>
+      </w:r>
+    </w:p>
+    <w:p>
+      <w:pPr>
+        <w:spacing w:after="180" w:before="120" w:line="360"/>
+      </w:pPr>
+      <w:r>
+        <w:rPr>
+          <w:rFonts w:ascii="Calibri" w:cs="Calibri" w:eastAsia="Calibri" w:hAnsi="Calibri"/>
+          <w:sz w:val="28"/>
+          <w:szCs w:val="28"/>
+        </w:rPr>
+        <w:t xml:space="preserve">No lado manual aplicámos quatro procedimentos. O primeiro: auditoria sistemática dos atributos accessibilityLabel, Role, Hint e State em 12 ficheiros e 78 componentes interactivos. O segundo: cálculo programático dos rácios de contraste de cada combinação de cor da paleta — todas acima do limiar AA. O terceiro: teste exploratório com o leitor de ecrã VoiceOver num iPhone real. E o quarto: verificação do reflow nos cinco níveis de tamanho de texto.</w:t>
+      </w:r>
+    </w:p>
+    <w:p>
+      <w:pPr>
+        <w:spacing w:after="180" w:before="120" w:line="360"/>
+      </w:pPr>
+      <w:r>
+        <w:rPr>
+          <w:rFonts w:ascii="Calibri" w:cs="Calibri" w:eastAsia="Calibri" w:hAnsi="Calibri"/>
+          <w:sz w:val="28"/>
+          <w:szCs w:val="28"/>
+        </w:rPr>
+        <w:t xml:space="preserve">Vou mostrar-vos quinze segundos do VoiceOver a navegar no ecrã principal — com o som dele a ler ao vivo:</w:t>
+      </w:r>
+    </w:p>
+    <w:p>
+      <w:pPr>
+        <w:spacing w:after="60" w:before="60"/>
+      </w:pPr>
+      <w:r>
+        <w:rPr>
+          <w:rFonts w:ascii="Calibri" w:cs="Calibri" w:eastAsia="Calibri" w:hAnsi="Calibri"/>
+          <w:i/>
+          <w:iCs/>
+          <w:color w:val="6E6E6E"/>
+          <w:sz w:val="22"/>
+          <w:szCs w:val="22"/>
+        </w:rPr>
+        <w:t xml:space="preserve">(Vídeo de 15 segundos com áudio do VoiceOver começa a tocar aqui.)</w:t>
+      </w:r>
+    </w:p>
+    <w:p>
+      <w:pPr>
+        <w:spacing w:after="180" w:before="120" w:line="360"/>
+      </w:pPr>
+      <w:r>
+        <w:rPr>
+          <w:rFonts w:ascii="Calibri" w:cs="Calibri" w:eastAsia="Calibri" w:hAnsi="Calibri"/>
+          <w:sz w:val="28"/>
+          <w:szCs w:val="28"/>
+        </w:rPr>
+        <w:t xml:space="preserve">Os resultados: 100 em 100 no Lighthouse, 29 dos 34 critérios WCAG 2.2 nível AA totalmente conformes — 85 por cento de conformidade plena — e identificámos no processo nove correcções concretas que foram aplicadas durante a própria Fase 2.</w:t>
+      </w:r>
+    </w:p>
+    <w:p>
+      <w:pPr>
+        <w:spacing w:after="180" w:before="120" w:line="360"/>
+      </w:pPr>
+      <w:r>
+        <w:rPr>
+          <w:rFonts w:ascii="Calibri" w:cs="Calibri" w:eastAsia="Calibri" w:hAnsi="Calibri"/>
+          <w:sz w:val="28"/>
+          <w:szCs w:val="28"/>
+        </w:rPr>
+        <w:t xml:space="preserve">A lição metodológica está aqui: o bug B-05, que afectava utilizadores com texto a 200 por cento, só foi descoberto pelo teste manual de responsividade — nenhuma das quatro ferramentas automáticas o apanhou.</w:t>
       </w:r>
     </w:p>
     <w:p>
@@ -822,7 +892,7 @@
           <w:sz w:val="22"/>
           <w:szCs w:val="22"/>
         </w:rPr>
-        <w:t xml:space="preserve">1 min 30 seg  ·  Slide 8</w:t>
+        <w:t xml:space="preserve">1 min 15 seg  ·  Slide 8</w:t>
       </w:r>
     </w:p>
     <w:p>
@@ -904,19 +974,6 @@
           <w:szCs w:val="28"/>
         </w:rPr>
         <w:t xml:space="preserve">Identificámos 17 problemas distintos no total. Propomos 6 melhorias prioritárias — todas triviais — que num dia de trabalho elevam a aplicação dos 96,9 para 100 por cento de taxa de sucesso na próxima iteração.</w:t>
-      </w:r>
-    </w:p>
-    <w:p>
-      <w:pPr>
-        <w:spacing w:after="180" w:before="120" w:line="360"/>
-      </w:pPr>
-      <w:r>
-        <w:rPr>
-          <w:rFonts w:ascii="Calibri" w:cs="Calibri" w:eastAsia="Calibri" w:hAnsi="Calibri"/>
-          <w:sz w:val="28"/>
-          <w:szCs w:val="28"/>
-        </w:rPr>
-        <w:t xml:space="preserve">E aliás, já implementámos uma delas: a legenda das cores dos marcadores no mapa, identificada por um dos peritos. Está visível no canto inferior esquerdo do mapa principal, recolhível para não poluir. Isto demonstra que o ciclo avaliação → correcção da nossa metodologia funciona na prática.</w:t>
       </w:r>
     </w:p>
     <w:p>

</xml_diff>